<commit_message>
PR1: add local project report
</commit_message>
<xml_diff>
--- a/docs/Титульный_лист_ПР1.docx
+++ b/docs/Титульный_лист_ПР1.docx
@@ -1,6 +1,6 @@
 
 <file path=word/document.xml><?xml version="1.0" encoding="utf-8"?>
-<w:document xmlns:wpc="http://schemas.microsoft.com/office/word/2010/wordprocessingCanvas" xmlns:cx="http://schemas.microsoft.com/office/drawing/2014/chartex" xmlns:cx1="http://schemas.microsoft.com/office/drawing/2015/9/8/chartex" xmlns:cx2="http://schemas.microsoft.com/office/drawing/2015/10/21/chartex" xmlns:cx3="http://schemas.microsoft.com/office/drawing/2016/5/9/chartex" xmlns:cx4="http://schemas.microsoft.com/office/drawing/2016/5/10/chartex" xmlns:cx5="http://schemas.microsoft.com/office/drawing/2016/5/11/chartex" xmlns:cx6="http://schemas.microsoft.com/office/drawing/2016/5/12/chartex" xmlns:cx7="http://schemas.microsoft.com/office/drawing/2016/5/13/chartex" xmlns:cx8="http://schemas.microsoft.com/office/drawing/2016/5/14/chartex" xmlns:mc="http://schemas.openxmlformats.org/markup-compatibility/2006" xmlns:aink="http://schemas.microsoft.com/office/drawing/2016/ink" xmlns:am3d="http://schemas.microsoft.com/office/drawing/2017/model3d" xmlns:o="urn:schemas-microsoft-com:office:office" xmlns:r="http://schemas.openxmlformats.org/officeDocument/2006/relationships" xmlns:m="http://schemas.openxmlformats.org/officeDocument/2006/math" xmlns:v="urn:schemas-microsoft-com:vml" xmlns:wp14="http://schemas.microsoft.com/office/word/2010/wordprocessingDrawing" xmlns:wp="http://schemas.openxmlformats.org/drawingml/2006/wordprocessingDrawing" xmlns:w10="urn:schemas-microsoft-com:office:word" xmlns:w="http://schemas.openxmlformats.org/wordprocessingml/2006/main" xmlns:w14="http://schemas.microsoft.com/office/word/2010/wordml" xmlns:w15="http://schemas.microsoft.com/office/word/2012/wordml" xmlns:w16cex="http://schemas.microsoft.com/office/word/2018/wordml/cex" xmlns:w16cid="http://schemas.microsoft.com/office/word/2016/wordml/cid" xmlns:w16="http://schemas.microsoft.com/office/word/2018/wordml" xmlns:w16sdtdh="http://schemas.microsoft.com/office/word/2020/wordml/sdtdatahash" xmlns:w16se="http://schemas.microsoft.com/office/word/2015/wordml/symex" xmlns:wpg="http://schemas.microsoft.com/office/word/2010/wordprocessingGroup" xmlns:wpi="http://schemas.microsoft.com/office/word/2010/wordprocessingInk" xmlns:wne="http://schemas.microsoft.com/office/word/2006/wordml" xmlns:wps="http://schemas.microsoft.com/office/word/2010/wordprocessingShape" mc:Ignorable="w14 w15 w16se w16cid w16 w16cex w16sdtdh wp14">
+<w:document xmlns:wpc="http://schemas.microsoft.com/office/word/2010/wordprocessingCanvas" xmlns:cx="http://schemas.microsoft.com/office/drawing/2014/chartex" xmlns:cx1="http://schemas.microsoft.com/office/drawing/2015/9/8/chartex" xmlns:cx2="http://schemas.microsoft.com/office/drawing/2015/10/21/chartex" xmlns:cx3="http://schemas.microsoft.com/office/drawing/2016/5/9/chartex" xmlns:cx4="http://schemas.microsoft.com/office/drawing/2016/5/10/chartex" xmlns:cx5="http://schemas.microsoft.com/office/drawing/2016/5/11/chartex" xmlns:cx6="http://schemas.microsoft.com/office/drawing/2016/5/12/chartex" xmlns:cx7="http://schemas.microsoft.com/office/drawing/2016/5/13/chartex" xmlns:cx8="http://schemas.microsoft.com/office/drawing/2016/5/14/chartex" xmlns:mc="http://schemas.openxmlformats.org/markup-compatibility/2006" xmlns:m="http://schemas.openxmlformats.org/officeDocument/2006/math" xmlns:aink="http://schemas.microsoft.com/office/drawing/2016/ink" xmlns:am3d="http://schemas.microsoft.com/office/drawing/2017/model3d" xmlns:oel="http://schemas.microsoft.com/office/2019/extlst" xmlns:r="http://schemas.openxmlformats.org/officeDocument/2006/relationships" xmlns:wp14="http://schemas.microsoft.com/office/word/2010/wordprocessingDrawing" xmlns:wp="http://schemas.openxmlformats.org/drawingml/2006/wordprocessingDrawing" xmlns:wpg="http://schemas.microsoft.com/office/word/2010/wordprocessingGroup" xmlns:wpi="http://schemas.microsoft.com/office/word/2010/wordprocessingInk" xmlns:wps="http://schemas.microsoft.com/office/word/2010/wordprocessingShape" xmlns:o="urn:schemas-microsoft-com:office:office" xmlns:v="urn:schemas-microsoft-com:vml" xmlns:w10="urn:schemas-microsoft-com:office:word" xmlns:w="http://schemas.openxmlformats.org/wordprocessingml/2006/main" xmlns:w14="http://schemas.microsoft.com/office/word/2010/wordml" xmlns:w15="http://schemas.microsoft.com/office/word/2012/wordml" xmlns:w16cex="http://schemas.microsoft.com/office/word/2018/wordml/cex" xmlns:w16cid="http://schemas.microsoft.com/office/word/2016/wordml/cid" xmlns:w16="http://schemas.microsoft.com/office/word/2018/wordml" xmlns:w16sdtdh="http://schemas.microsoft.com/office/word/2020/wordml/sdtdatahash" xmlns:w16sdtfl="http://schemas.microsoft.com/office/word/2024/wordml/sdtformatlock" xmlns:w16se="http://schemas.microsoft.com/office/word/2015/wordml/symex" xmlns:w16du="http://schemas.microsoft.com/office/word/2023/wordml/word16du" xmlns:wne="http://schemas.microsoft.com/office/word/2006/wordml" mc:Ignorable="w14 w15 w16se w16cid w16 w16cex w16sdtdh w16sdtfl w16du wp14">
   <w:body>
     <w:tbl>
       <w:tblPr>
@@ -406,7 +406,6 @@
           <w:tab w:val="left" w:pos="9355"/>
         </w:tabs>
         <w:spacing w:after="0" w:line="360" w:lineRule="auto"/>
-        <w:jc w:val="left"/>
         <w:rPr>
           <w:rFonts w:ascii="Times New Roman" w:eastAsia="Calibri" w:hAnsi="Times New Roman" w:cs="Times New Roman"/>
           <w:b/>
@@ -453,6 +452,14 @@
           <w:u w:val="single"/>
         </w:rPr>
         <w:t>Основы Python: актуализация знаний</w:t>
+      </w:r>
+      <w:r>
+        <w:rPr>
+          <w:rFonts w:ascii="Times New Roman" w:eastAsia="Calibri" w:hAnsi="Times New Roman" w:cs="Times New Roman"/>
+          <w:sz w:val="28"/>
+          <w:szCs w:val="28"/>
+          <w:u w:val="single"/>
+        </w:rPr>
         <w:br/>
         <w:t>и настройка рабочего окружения</w:t>
       </w:r>
@@ -460,7 +467,6 @@
     <w:p>
       <w:pPr>
         <w:spacing w:after="0" w:line="360" w:lineRule="auto"/>
-        <w:jc w:val="left"/>
         <w:rPr>
           <w:rFonts w:ascii="Times New Roman" w:eastAsia="Calibri" w:hAnsi="Times New Roman" w:cs="Times New Roman"/>
           <w:b/>
@@ -629,6 +635,25 @@
               </w:rPr>
               <w:t>студент группы</w:t>
             </w:r>
+            <w:r>
+              <w:rPr>
+                <w:rFonts w:ascii="Times New Roman" w:eastAsia="Calibri" w:hAnsi="Times New Roman" w:cs="Times New Roman"/>
+                <w:kern w:val="2"/>
+                <w:sz w:val="28"/>
+                <w:lang w:val="en-US"/>
+                <w14:ligatures w14:val="standardContextual"/>
+              </w:rPr>
+              <w:t xml:space="preserve"> </w:t>
+            </w:r>
+            <w:r>
+              <w:rPr>
+                <w:rFonts w:ascii="Times New Roman" w:eastAsia="Calibri" w:hAnsi="Times New Roman" w:cs="Times New Roman"/>
+                <w:kern w:val="2"/>
+                <w:sz w:val="28"/>
+                <w14:ligatures w14:val="standardContextual"/>
+              </w:rPr>
+              <w:t>ЭФБО-03-24</w:t>
+            </w:r>
           </w:p>
           <w:p>
             <w:pPr>
@@ -714,6 +739,15 @@
                 <w14:ligatures w14:val="standardContextual"/>
               </w:rPr>
             </w:pPr>
+            <w:r>
+              <w:rPr>
+                <w:rFonts w:ascii="Times New Roman" w:eastAsia="Calibri" w:hAnsi="Times New Roman" w:cs="Times New Roman"/>
+                <w:kern w:val="2"/>
+                <w:sz w:val="28"/>
+                <w14:ligatures w14:val="standardContextual"/>
+              </w:rPr>
+              <w:t>Галанов А.В.</w:t>
+            </w:r>
           </w:p>
         </w:tc>
       </w:tr>
@@ -1597,7 +1631,7 @@
 </file>
 
 <file path=word/numbering.xml><?xml version="1.0" encoding="utf-8"?>
-<w:numbering xmlns:wpc="http://schemas.microsoft.com/office/word/2010/wordprocessingCanvas" xmlns:cx="http://schemas.microsoft.com/office/drawing/2014/chartex" xmlns:cx1="http://schemas.microsoft.com/office/drawing/2015/9/8/chartex" xmlns:cx2="http://schemas.microsoft.com/office/drawing/2015/10/21/chartex" xmlns:cx3="http://schemas.microsoft.com/office/drawing/2016/5/9/chartex" xmlns:cx4="http://schemas.microsoft.com/office/drawing/2016/5/10/chartex" xmlns:cx5="http://schemas.microsoft.com/office/drawing/2016/5/11/chartex" xmlns:cx6="http://schemas.microsoft.com/office/drawing/2016/5/12/chartex" xmlns:cx7="http://schemas.microsoft.com/office/drawing/2016/5/13/chartex" xmlns:cx8="http://schemas.microsoft.com/office/drawing/2016/5/14/chartex" xmlns:mc="http://schemas.openxmlformats.org/markup-compatibility/2006" xmlns:aink="http://schemas.microsoft.com/office/drawing/2016/ink" xmlns:am3d="http://schemas.microsoft.com/office/drawing/2017/model3d" xmlns:o="urn:schemas-microsoft-com:office:office" xmlns:r="http://schemas.openxmlformats.org/officeDocument/2006/relationships" xmlns:m="http://schemas.openxmlformats.org/officeDocument/2006/math" xmlns:v="urn:schemas-microsoft-com:vml" xmlns:wp14="http://schemas.microsoft.com/office/word/2010/wordprocessingDrawing" xmlns:wp="http://schemas.openxmlformats.org/drawingml/2006/wordprocessingDrawing" xmlns:w10="urn:schemas-microsoft-com:office:word" xmlns:w="http://schemas.openxmlformats.org/wordprocessingml/2006/main" xmlns:w14="http://schemas.microsoft.com/office/word/2010/wordml" xmlns:w15="http://schemas.microsoft.com/office/word/2012/wordml" xmlns:w16cex="http://schemas.microsoft.com/office/word/2018/wordml/cex" xmlns:w16cid="http://schemas.microsoft.com/office/word/2016/wordml/cid" xmlns:w16="http://schemas.microsoft.com/office/word/2018/wordml" xmlns:w16sdtdh="http://schemas.microsoft.com/office/word/2020/wordml/sdtdatahash" xmlns:w16se="http://schemas.microsoft.com/office/word/2015/wordml/symex" xmlns:wpg="http://schemas.microsoft.com/office/word/2010/wordprocessingGroup" xmlns:wpi="http://schemas.microsoft.com/office/word/2010/wordprocessingInk" xmlns:wne="http://schemas.microsoft.com/office/word/2006/wordml" xmlns:wps="http://schemas.microsoft.com/office/word/2010/wordprocessingShape" mc:Ignorable="w14 w15 w16se w16cid w16 w16cex w16sdtdh wp14">
+<w:numbering xmlns:wpc="http://schemas.microsoft.com/office/word/2010/wordprocessingCanvas" xmlns:cx="http://schemas.microsoft.com/office/drawing/2014/chartex" xmlns:cx1="http://schemas.microsoft.com/office/drawing/2015/9/8/chartex" xmlns:cx2="http://schemas.microsoft.com/office/drawing/2015/10/21/chartex" xmlns:cx3="http://schemas.microsoft.com/office/drawing/2016/5/9/chartex" xmlns:cx4="http://schemas.microsoft.com/office/drawing/2016/5/10/chartex" xmlns:cx5="http://schemas.microsoft.com/office/drawing/2016/5/11/chartex" xmlns:cx6="http://schemas.microsoft.com/office/drawing/2016/5/12/chartex" xmlns:cx7="http://schemas.microsoft.com/office/drawing/2016/5/13/chartex" xmlns:cx8="http://schemas.microsoft.com/office/drawing/2016/5/14/chartex" xmlns:mc="http://schemas.openxmlformats.org/markup-compatibility/2006" xmlns:m="http://schemas.openxmlformats.org/officeDocument/2006/math" xmlns:aink="http://schemas.microsoft.com/office/drawing/2016/ink" xmlns:am3d="http://schemas.microsoft.com/office/drawing/2017/model3d" xmlns:oel="http://schemas.microsoft.com/office/2019/extlst" xmlns:r="http://schemas.openxmlformats.org/officeDocument/2006/relationships" xmlns:wp14="http://schemas.microsoft.com/office/word/2010/wordprocessingDrawing" xmlns:wp="http://schemas.openxmlformats.org/drawingml/2006/wordprocessingDrawing" xmlns:wpg="http://schemas.microsoft.com/office/word/2010/wordprocessingGroup" xmlns:wpi="http://schemas.microsoft.com/office/word/2010/wordprocessingInk" xmlns:wps="http://schemas.microsoft.com/office/word/2010/wordprocessingShape" xmlns:o="urn:schemas-microsoft-com:office:office" xmlns:v="urn:schemas-microsoft-com:vml" xmlns:w10="urn:schemas-microsoft-com:office:word" xmlns:w="http://schemas.openxmlformats.org/wordprocessingml/2006/main" xmlns:w14="http://schemas.microsoft.com/office/word/2010/wordml" xmlns:w15="http://schemas.microsoft.com/office/word/2012/wordml" xmlns:w16cex="http://schemas.microsoft.com/office/word/2018/wordml/cex" xmlns:w16cid="http://schemas.microsoft.com/office/word/2016/wordml/cid" xmlns:w16="http://schemas.microsoft.com/office/word/2018/wordml" xmlns:w16sdtdh="http://schemas.microsoft.com/office/word/2020/wordml/sdtdatahash" xmlns:w16sdtfl="http://schemas.microsoft.com/office/word/2024/wordml/sdtformatlock" xmlns:w16se="http://schemas.microsoft.com/office/word/2015/wordml/symex" xmlns:w16du="http://schemas.microsoft.com/office/word/2023/wordml/word16du" xmlns:wne="http://schemas.microsoft.com/office/word/2006/wordml" mc:Ignorable="w14 w15 w16se w16cid w16 w16cex w16sdtdh w16sdtfl w16du wp14">
   <w:abstractNum w:abstractNumId="0" w15:restartNumberingAfterBreak="0">
     <w:nsid w:val="5BA23181"/>
     <w:multiLevelType w:val="hybridMultilevel"/>
@@ -1711,14 +1745,14 @@
       </w:rPr>
     </w:lvl>
   </w:abstractNum>
-  <w:num w:numId="1">
+  <w:num w:numId="1" w16cid:durableId="2144691275">
     <w:abstractNumId w:val="0"/>
   </w:num>
 </w:numbering>
 </file>
 
 <file path=word/styles.xml><?xml version="1.0" encoding="utf-8"?>
-<w:styles xmlns:mc="http://schemas.openxmlformats.org/markup-compatibility/2006" xmlns:r="http://schemas.openxmlformats.org/officeDocument/2006/relationships" xmlns:w="http://schemas.openxmlformats.org/wordprocessingml/2006/main" xmlns:w14="http://schemas.microsoft.com/office/word/2010/wordml" xmlns:w15="http://schemas.microsoft.com/office/word/2012/wordml" xmlns:w16cex="http://schemas.microsoft.com/office/word/2018/wordml/cex" xmlns:w16cid="http://schemas.microsoft.com/office/word/2016/wordml/cid" xmlns:w16="http://schemas.microsoft.com/office/word/2018/wordml" xmlns:w16sdtdh="http://schemas.microsoft.com/office/word/2020/wordml/sdtdatahash" xmlns:w16se="http://schemas.microsoft.com/office/word/2015/wordml/symex" mc:Ignorable="w14 w15 w16se w16cid w16 w16cex w16sdtdh">
+<w:styles xmlns:mc="http://schemas.openxmlformats.org/markup-compatibility/2006" xmlns:r="http://schemas.openxmlformats.org/officeDocument/2006/relationships" xmlns:w="http://schemas.openxmlformats.org/wordprocessingml/2006/main" xmlns:w14="http://schemas.microsoft.com/office/word/2010/wordml" xmlns:w15="http://schemas.microsoft.com/office/word/2012/wordml" xmlns:w16cex="http://schemas.microsoft.com/office/word/2018/wordml/cex" xmlns:w16cid="http://schemas.microsoft.com/office/word/2016/wordml/cid" xmlns:w16="http://schemas.microsoft.com/office/word/2018/wordml" xmlns:w16sdtdh="http://schemas.microsoft.com/office/word/2020/wordml/sdtdatahash" xmlns:w16sdtfl="http://schemas.microsoft.com/office/word/2024/wordml/sdtformatlock" xmlns:w16se="http://schemas.microsoft.com/office/word/2015/wordml/symex" xmlns:w16du="http://schemas.microsoft.com/office/word/2023/wordml/word16du" mc:Ignorable="w14 w15 w16se w16cid w16 w16cex w16sdtdh w16sdtfl w16du">
   <w:docDefaults>
     <w:rPrDefault>
       <w:rPr>
@@ -1891,7 +1925,7 @@
     <w:lsdException w:name="Table Web 2" w:semiHidden="1" w:unhideWhenUsed="1"/>
     <w:lsdException w:name="Table Web 3" w:semiHidden="1" w:unhideWhenUsed="1"/>
     <w:lsdException w:name="Balloon Text" w:semiHidden="1" w:unhideWhenUsed="1"/>
-    <w:lsdException w:name="Table Grid" w:semiHidden="1" w:uiPriority="39" w:unhideWhenUsed="1"/>
+    <w:lsdException w:name="Table Grid" w:uiPriority="39"/>
     <w:lsdException w:name="Table Theme" w:semiHidden="1" w:unhideWhenUsed="1"/>
     <w:lsdException w:name="Placeholder Text" w:semiHidden="1"/>
     <w:lsdException w:name="No Spacing" w:uiPriority="1" w:qFormat="1"/>

</xml_diff>